<commit_message>
Harden two-user Microsoft 365 pilot launch
</commit_message>
<xml_diff>
--- a/fixtures/clause_library/SAMPLE_Northstar_Operating_Agreement.docx
+++ b/fixtures/clause_library/SAMPLE_Northstar_Operating_Agreement.docx
@@ -38,7 +38,7 @@
           <w:color w:val="1B2430"/>
           <w:sz w:val="20"/>
         </w:rPr>
-        <w:t xml:space="preserve"> Assembled from approved clause variants; not legal advice.</w:t>
+        <w:t xml:space="preserve"> Assembled from synthetic evaluation variants; not adopted by Tessera, not counsel-approved, and not legal advice.</w:t>
       </w:r>
     </w:p>
     <w:p>
@@ -404,6 +404,31 @@
           <w:color w:val="1B2430"/>
           <w:sz w:val="20"/>
         </w:rPr>
+        <w:t>“Disability”</w:t>
+      </w:r>
+      <w:r>
+        <w:rPr>
+          <w:rFonts w:ascii="Calibri" w:hAnsi="Calibri"/>
+          <w:b w:val="0"/>
+          <w:i w:val="0"/>
+          <w:color w:val="1B2430"/>
+          <w:sz w:val="20"/>
+        </w:rPr>
+        <w:t xml:space="preserve"> The inability of a Member, due to physical or mental incapacity, substantially to perform such Member's duties to the Company for either (i) 90 consecutive days or (ii) 120 days in any trailing period of 180 days, as reasonably determined by the other Members in good faith and, if disputed, confirmed by a licensed physician mutually acceptable to the Members.</w:t>
+      </w:r>
+    </w:p>
+    <w:p>
+      <w:pPr>
+        <w:spacing w:after="140" w:line="276" w:lineRule="auto"/>
+      </w:pPr>
+      <w:r>
+        <w:rPr>
+          <w:rFonts w:ascii="Calibri" w:hAnsi="Calibri"/>
+          <w:b/>
+          <w:i w:val="0"/>
+          <w:color w:val="1B2430"/>
+          <w:sz w:val="20"/>
+        </w:rPr>
         <w:t>“Distributable Cash”</w:t>
       </w:r>
       <w:r>
@@ -415,6 +440,31 @@
           <w:sz w:val="20"/>
         </w:rPr>
         <w:t xml:space="preserve"> means cash held by the Company that the Manager determines is not required for Company obligations or reasonable reserves.</w:t>
+      </w:r>
+    </w:p>
+    <w:p>
+      <w:pPr>
+        <w:spacing w:after="140" w:line="276" w:lineRule="auto"/>
+      </w:pPr>
+      <w:r>
+        <w:rPr>
+          <w:rFonts w:ascii="Calibri" w:hAnsi="Calibri"/>
+          <w:b/>
+          <w:i w:val="0"/>
+          <w:color w:val="1B2430"/>
+          <w:sz w:val="20"/>
+        </w:rPr>
+        <w:t>“Fair Market Value”</w:t>
+      </w:r>
+      <w:r>
+        <w:rPr>
+          <w:rFonts w:ascii="Calibri" w:hAnsi="Calibri"/>
+          <w:b w:val="0"/>
+          <w:i w:val="0"/>
+          <w:color w:val="1B2430"/>
+          <w:sz w:val="20"/>
+        </w:rPr>
+        <w:t xml:space="preserve"> The value of a Membership Interest determined in accordance with the Fair Market Value section of this Agreement.</w:t>
       </w:r>
     </w:p>
     <w:p>
@@ -579,6 +629,31 @@
           <w:color w:val="1B2430"/>
           <w:sz w:val="20"/>
         </w:rPr>
+        <w:t>“Triggering Event”</w:t>
+      </w:r>
+      <w:r>
+        <w:rPr>
+          <w:rFonts w:ascii="Calibri" w:hAnsi="Calibri"/>
+          <w:b w:val="0"/>
+          <w:i w:val="0"/>
+          <w:color w:val="1B2430"/>
+          <w:sz w:val="20"/>
+        </w:rPr>
+        <w:t xml:space="preserve"> Each event listed in the Triggering Events section of this Agreement, in each case with respect to the Member to whom it relates.</w:t>
+      </w:r>
+    </w:p>
+    <w:p>
+      <w:pPr>
+        <w:spacing w:after="140" w:line="276" w:lineRule="auto"/>
+      </w:pPr>
+      <w:r>
+        <w:rPr>
+          <w:rFonts w:ascii="Calibri" w:hAnsi="Calibri"/>
+          <w:b/>
+          <w:i w:val="0"/>
+          <w:color w:val="1B2430"/>
+          <w:sz w:val="20"/>
+        </w:rPr>
         <w:t>“Units”</w:t>
       </w:r>
       <w:r>
@@ -1002,7 +1077,22 @@
           <w:color w:val="1B2430"/>
           <w:sz w:val="20"/>
         </w:rPr>
-        <w:t>(c) thereafter, 80% to the Members in proportion to their Units and the balance to Northstar Sponsor LLC as a promote.</w:t>
+        <w:t>(c) third, to Northstar Sponsor LLC until it has received an amount equal to the promote percentage of all amounts distributed under paragraph (a) and this paragraph (c) (the “Catch-Up”); and</w:t>
+      </w:r>
+    </w:p>
+    <w:p>
+      <w:pPr>
+        <w:spacing w:after="140" w:line="276" w:lineRule="auto"/>
+      </w:pPr>
+      <w:r>
+        <w:rPr>
+          <w:rFonts w:ascii="Calibri" w:hAnsi="Calibri"/>
+          <w:b w:val="0"/>
+          <w:i w:val="0"/>
+          <w:color w:val="1B2430"/>
+          <w:sz w:val="20"/>
+        </w:rPr>
+        <w:t>(d) thereafter, 80% to the Members in proportion to their Units and the balance to Northstar Sponsor LLC as a promote.</w:t>
       </w:r>
     </w:p>
     <w:p>
@@ -1067,7 +1157,32 @@
           <w:color w:val="1B2430"/>
           <w:sz w:val="20"/>
         </w:rPr>
-        <w:t>5.4 Withholding.</w:t>
+        <w:t>5.4 Clawback.</w:t>
+      </w:r>
+      <w:r>
+        <w:rPr>
+          <w:rFonts w:ascii="Calibri" w:hAnsi="Calibri"/>
+          <w:b w:val="0"/>
+          <w:i w:val="0"/>
+          <w:color w:val="1B2430"/>
+          <w:sz w:val="20"/>
+        </w:rPr>
+        <w:t xml:space="preserve"> If, upon the final liquidating distribution, Northstar Sponsor LLC has received cumulative promote distributions exceeding the amount it would have received had all distributions been made at one time under Section 5.1, Northstar Sponsor LLC shall return the excess to the Company for distribution to the other Members.</w:t>
+      </w:r>
+    </w:p>
+    <w:p>
+      <w:pPr>
+        <w:spacing w:after="140" w:line="276" w:lineRule="auto"/>
+      </w:pPr>
+      <w:r>
+        <w:rPr>
+          <w:rFonts w:ascii="Calibri" w:hAnsi="Calibri"/>
+          <w:b/>
+          <w:i w:val="0"/>
+          <w:color w:val="1B2430"/>
+          <w:sz w:val="20"/>
+        </w:rPr>
+        <w:t>5.5 Withholding.</w:t>
       </w:r>
       <w:r>
         <w:rPr>
@@ -1094,7 +1209,7 @@
           <w:color w:val="0B1F3A"/>
           <w:sz w:val="24"/>
         </w:rPr>
-        <w:t>6. Management</w:t>
+        <w:t>6. Titles and Authority</w:t>
       </w:r>
     </w:p>
     <w:p>
@@ -1109,7 +1224,7 @@
           <w:color w:val="1B2430"/>
           <w:sz w:val="20"/>
         </w:rPr>
-        <w:t>6.1 Management.</w:t>
+        <w:t>6. Titles.</w:t>
       </w:r>
       <w:r>
         <w:rPr>
@@ -1119,7 +1234,24 @@
           <w:color w:val="1B2430"/>
           <w:sz w:val="20"/>
         </w:rPr>
-        <w:t xml:space="preserve"> The Company is member-managed. Each Managing Member has equal authority, rights, and responsibilities with respect to the management and control of the Company's business and affairs, subject to the Major Decisions set out in Section 7.</w:t>
+        <w:t xml:space="preserve"> The Members may adopt titles for use in the conduct of the Company's business. No title, however designated, confers authority, voting power, economic entitlement, or Percentage Interest beyond that expressly granted by this Agreement, and no Person dealing with the Company is entitled to rely on a title as evidence of authority to bind the Company.</w:t>
+      </w:r>
+    </w:p>
+    <w:p>
+      <w:pPr>
+        <w:spacing w:before="300" w:after="120"/>
+        <w:pBdr>
+          <w:bottom w:val="single" w:sz="4" w:space="4" w:color="B8963E"/>
+        </w:pBdr>
+      </w:pPr>
+      <w:r>
+        <w:rPr>
+          <w:rFonts w:ascii="Georgia" w:hAnsi="Georgia"/>
+          <w:b/>
+          <w:color w:val="0B1F3A"/>
+          <w:sz w:val="24"/>
+        </w:rPr>
+        <w:t>7. Management</w:t>
       </w:r>
     </w:p>
     <w:p>
@@ -1134,7 +1266,32 @@
           <w:color w:val="1B2430"/>
           <w:sz w:val="20"/>
         </w:rPr>
-        <w:t>6.2 Standard of Care.</w:t>
+        <w:t>7.1 Management.</w:t>
+      </w:r>
+      <w:r>
+        <w:rPr>
+          <w:rFonts w:ascii="Calibri" w:hAnsi="Calibri"/>
+          <w:b w:val="0"/>
+          <w:i w:val="0"/>
+          <w:color w:val="1B2430"/>
+          <w:sz w:val="20"/>
+        </w:rPr>
+        <w:t xml:space="preserve"> The Company is member-managed. Each Managing Member has equal authority, rights, and responsibilities with respect to the management and control of the Company's business and affairs, subject to the Major Decisions set out in Section 8.</w:t>
+      </w:r>
+    </w:p>
+    <w:p>
+      <w:pPr>
+        <w:spacing w:after="140" w:line="276" w:lineRule="auto"/>
+      </w:pPr>
+      <w:r>
+        <w:rPr>
+          <w:rFonts w:ascii="Calibri" w:hAnsi="Calibri"/>
+          <w:b/>
+          <w:i w:val="0"/>
+          <w:color w:val="1B2430"/>
+          <w:sz w:val="20"/>
+        </w:rPr>
+        <w:t>7.2 Standard of Care.</w:t>
       </w:r>
       <w:r>
         <w:rPr>
@@ -1159,7 +1316,7 @@
           <w:color w:val="1B2430"/>
           <w:sz w:val="20"/>
         </w:rPr>
-        <w:t>6.3 Outside Activities.</w:t>
+        <w:t>7.3 Outside Activities.</w:t>
       </w:r>
       <w:r>
         <w:rPr>
@@ -1169,7 +1326,7 @@
           <w:color w:val="1B2430"/>
           <w:sz w:val="20"/>
         </w:rPr>
-        <w:t xml:space="preserve"> Subject to the restrictive covenants in Section 14, each Member may engage in other business activities, provided they do not materially interfere with that Member's duties to the Company.</w:t>
+        <w:t xml:space="preserve"> Subject to the restrictive covenants in Section 21, each Member may engage in other business activities, provided they do not materially interfere with that Member's duties to the Company.</w:t>
       </w:r>
     </w:p>
     <w:p>
@@ -1184,7 +1341,7 @@
           <w:color w:val="1B2430"/>
           <w:sz w:val="20"/>
         </w:rPr>
-        <w:t>6.4 Officers.</w:t>
+        <w:t>7.4 Officers.</w:t>
       </w:r>
       <w:r>
         <w:rPr>
@@ -1211,7 +1368,7 @@
           <w:color w:val="0B1F3A"/>
           <w:sz w:val="24"/>
         </w:rPr>
-        <w:t>7. Member Authority and Reserved Decisions</w:t>
+        <w:t>8. Member Authority and Reserved Decisions</w:t>
       </w:r>
     </w:p>
     <w:p>
@@ -1226,7 +1383,7 @@
           <w:color w:val="1B2430"/>
           <w:sz w:val="20"/>
         </w:rPr>
-        <w:t>7.1 Routine Authority.</w:t>
+        <w:t>8.1 Routine Authority.</w:t>
       </w:r>
       <w:r>
         <w:rPr>
@@ -1251,7 +1408,7 @@
           <w:color w:val="1B2430"/>
           <w:sz w:val="20"/>
         </w:rPr>
-        <w:t>7.2 Major Decisions.</w:t>
+        <w:t>8.2 Major Decisions.</w:t>
       </w:r>
       <w:r>
         <w:rPr>
@@ -1278,7 +1435,7 @@
           <w:color w:val="0B1F3A"/>
           <w:sz w:val="24"/>
         </w:rPr>
-        <w:t>8. Transfer Restrictions</w:t>
+        <w:t>9. Transfer Restrictions</w:t>
       </w:r>
     </w:p>
     <w:p>
@@ -1293,7 +1450,7 @@
           <w:color w:val="1B2430"/>
           <w:sz w:val="20"/>
         </w:rPr>
-        <w:t>8.1 General Restriction.</w:t>
+        <w:t>9.1 General Restriction.</w:t>
       </w:r>
       <w:r>
         <w:rPr>
@@ -1318,7 +1475,7 @@
           <w:color w:val="1B2430"/>
           <w:sz w:val="20"/>
         </w:rPr>
-        <w:t>8.2 Permitted Transfers.</w:t>
+        <w:t>9.2 Permitted Transfers.</w:t>
       </w:r>
       <w:r>
         <w:rPr>
@@ -1328,7 +1485,7 @@
           <w:color w:val="1B2430"/>
           <w:sz w:val="20"/>
         </w:rPr>
-        <w:t xml:space="preserve"> A Member may Transfer Units to a Permitted Transferee without complying with Section 8.3, provided the transferee executes a joinder to this Agreement. "Permitted Transferee" means, for an entity Member, an entity wholly owned by it or by its ultimate beneficial owners; transfers by an individual Member for estate-planning purposes are governed by Section 9.</w:t>
+        <w:t xml:space="preserve"> A Member may Transfer Units to a Permitted Transferee without complying with Section 9.3, provided the transferee executes a joinder to this Agreement. "Permitted Transferee" means, for an entity Member, an entity wholly owned by it or by its ultimate beneficial owners; transfers by an individual Member for estate-planning purposes are governed by Section 10.</w:t>
       </w:r>
     </w:p>
     <w:p>
@@ -1343,7 +1500,7 @@
           <w:color w:val="1B2430"/>
           <w:sz w:val="20"/>
         </w:rPr>
-        <w:t>8.3 Right of First Refusal.</w:t>
+        <w:t>9.3 Right of First Refusal.</w:t>
       </w:r>
       <w:r>
         <w:rPr>
@@ -1368,7 +1525,7 @@
           <w:color w:val="1B2430"/>
           <w:sz w:val="20"/>
         </w:rPr>
-        <w:t>8.4 Conditions to Any Transfer.</w:t>
+        <w:t>9.4 Conditions to Any Transfer.</w:t>
       </w:r>
       <w:r>
         <w:rPr>
@@ -1393,7 +1550,7 @@
           <w:color w:val="1B2430"/>
           <w:sz w:val="20"/>
         </w:rPr>
-        <w:t>8.5 Admission.</w:t>
+        <w:t>9.5 Admission.</w:t>
       </w:r>
       <w:r>
         <w:rPr>
@@ -1403,7 +1560,7 @@
           <w:color w:val="1B2430"/>
           <w:sz w:val="20"/>
         </w:rPr>
-        <w:t xml:space="preserve"> A transferee becomes a Member only on satisfying Section 8.4 and, in the case of a Transfer other than to a Permitted Transferee, on the Approval of the Members. A transferee who is not admitted as a Member holds only an economic interest, with no voting, consent, information, or management rights.</w:t>
+        <w:t xml:space="preserve"> A transferee becomes a Member only on satisfying Section 9.4 and, in the case of a Transfer other than to a Permitted Transferee, on the Approval of the Members. A transferee who is not admitted as a Member holds only an economic interest, with no voting, consent, information, or management rights.</w:t>
       </w:r>
     </w:p>
     <w:p>
@@ -1420,7 +1577,7 @@
           <w:color w:val="0B1F3A"/>
           <w:sz w:val="24"/>
         </w:rPr>
-        <w:t>9. Proposed Estate-Planning Transfer</w:t>
+        <w:t>10. Proposed Estate-Planning Transfer</w:t>
       </w:r>
     </w:p>
     <w:p>
@@ -1435,7 +1592,7 @@
           <w:color w:val="1B2430"/>
           <w:sz w:val="20"/>
         </w:rPr>
-        <w:t>9. Estate-Planning Transfers.</w:t>
+        <w:t>10. Estate-Planning Transfers.</w:t>
       </w:r>
       <w:r>
         <w:rPr>
@@ -1462,7 +1619,7 @@
           <w:color w:val="0B1F3A"/>
           <w:sz w:val="24"/>
         </w:rPr>
-        <w:t>10. Deadlock Review Process</w:t>
+        <w:t>11. Deadlock Review Process</w:t>
       </w:r>
     </w:p>
     <w:p>
@@ -1477,7 +1634,7 @@
           <w:color w:val="1B2430"/>
           <w:sz w:val="20"/>
         </w:rPr>
-        <w:t>10. Deadlock Review.</w:t>
+        <w:t>11. Deadlock Review.</w:t>
       </w:r>
       <w:r>
         <w:rPr>
@@ -1504,7 +1661,7 @@
           <w:color w:val="0B1F3A"/>
           <w:sz w:val="24"/>
         </w:rPr>
-        <w:t>11. Duties, Exculpation, and Indemnification</w:t>
+        <w:t>12. Triggering Events</w:t>
       </w:r>
     </w:p>
     <w:p>
@@ -1519,7 +1676,405 @@
           <w:color w:val="1B2430"/>
           <w:sz w:val="20"/>
         </w:rPr>
-        <w:t>11.1 Duties.</w:t>
+        <w:t>12. Triggering Events.</w:t>
+      </w:r>
+      <w:r>
+        <w:rPr>
+          <w:rFonts w:ascii="Calibri" w:hAnsi="Calibri"/>
+          <w:b w:val="0"/>
+          <w:i w:val="0"/>
+          <w:color w:val="1B2430"/>
+          <w:sz w:val="20"/>
+        </w:rPr>
+        <w:t xml:space="preserve"> Each of the following constitutes a “Triggering Event” with respect to a Member (the “Triggering Member”):</w:t>
+      </w:r>
+    </w:p>
+    <w:p>
+      <w:pPr>
+        <w:spacing w:after="140" w:line="276" w:lineRule="auto"/>
+      </w:pPr>
+      <w:r>
+        <w:rPr>
+          <w:rFonts w:ascii="Calibri" w:hAnsi="Calibri"/>
+          <w:b w:val="0"/>
+          <w:i w:val="0"/>
+          <w:color w:val="1B2430"/>
+          <w:sz w:val="20"/>
+        </w:rPr>
+        <w:t>(a) the death of the Triggering Member;</w:t>
+      </w:r>
+    </w:p>
+    <w:p>
+      <w:pPr>
+        <w:spacing w:after="140" w:line="276" w:lineRule="auto"/>
+      </w:pPr>
+      <w:r>
+        <w:rPr>
+          <w:rFonts w:ascii="Calibri" w:hAnsi="Calibri"/>
+          <w:b w:val="0"/>
+          <w:i w:val="0"/>
+          <w:color w:val="1B2430"/>
+          <w:sz w:val="20"/>
+        </w:rPr>
+        <w:t>(b) the Disability of the Triggering Member;</w:t>
+      </w:r>
+    </w:p>
+    <w:p>
+      <w:pPr>
+        <w:spacing w:after="140" w:line="276" w:lineRule="auto"/>
+      </w:pPr>
+      <w:r>
+        <w:rPr>
+          <w:rFonts w:ascii="Calibri" w:hAnsi="Calibri"/>
+          <w:b w:val="0"/>
+          <w:i w:val="0"/>
+          <w:color w:val="1B2430"/>
+          <w:sz w:val="20"/>
+        </w:rPr>
+        <w:t>(c) the filing of a voluntary or involuntary bankruptcy petition by or against the Triggering Member, or an assignment for the benefit of creditors;</w:t>
+      </w:r>
+    </w:p>
+    <w:p>
+      <w:pPr>
+        <w:spacing w:after="140" w:line="276" w:lineRule="auto"/>
+      </w:pPr>
+      <w:r>
+        <w:rPr>
+          <w:rFonts w:ascii="Calibri" w:hAnsi="Calibri"/>
+          <w:b w:val="0"/>
+          <w:i w:val="0"/>
+          <w:color w:val="1B2430"/>
+          <w:sz w:val="20"/>
+        </w:rPr>
+        <w:t>(d) a divorce, dissolution of marriage, or other proceeding that would Transfer any portion of the Triggering Member's Membership Interest to a spouse or former spouse, other than pursuant to a premarital or postmarital agreement waiving such interest;</w:t>
+      </w:r>
+    </w:p>
+    <w:p>
+      <w:pPr>
+        <w:spacing w:after="140" w:line="276" w:lineRule="auto"/>
+      </w:pPr>
+      <w:r>
+        <w:rPr>
+          <w:rFonts w:ascii="Calibri" w:hAnsi="Calibri"/>
+          <w:b w:val="0"/>
+          <w:i w:val="0"/>
+          <w:color w:val="1B2430"/>
+          <w:sz w:val="20"/>
+        </w:rPr>
+        <w:t>(e) the voluntary withdrawal or resignation of the Triggering Member from active involvement in the Company;</w:t>
+      </w:r>
+    </w:p>
+    <w:p>
+      <w:pPr>
+        <w:spacing w:after="140" w:line="276" w:lineRule="auto"/>
+      </w:pPr>
+      <w:r>
+        <w:rPr>
+          <w:rFonts w:ascii="Calibri" w:hAnsi="Calibri"/>
+          <w:b w:val="0"/>
+          <w:i w:val="0"/>
+          <w:color w:val="1B2430"/>
+          <w:sz w:val="20"/>
+        </w:rPr>
+        <w:t>(f) a material, uncured breach of this Agreement by the Triggering Member, continuing for 30 days after written notice from another Member specifying the breach; or</w:t>
+      </w:r>
+    </w:p>
+    <w:p>
+      <w:pPr>
+        <w:spacing w:after="140" w:line="276" w:lineRule="auto"/>
+      </w:pPr>
+      <w:r>
+        <w:rPr>
+          <w:rFonts w:ascii="Calibri" w:hAnsi="Calibri"/>
+          <w:b w:val="0"/>
+          <w:i w:val="0"/>
+          <w:color w:val="1B2430"/>
+          <w:sz w:val="20"/>
+        </w:rPr>
+        <w:t>(g) the conviction of, or plea of guilty or no contest by, the Triggering Member to a felony or any crime involving fraud, dishonesty, or moral turpitude, in each case materially and adversely affecting the Company.</w:t>
+      </w:r>
+    </w:p>
+    <w:p>
+      <w:pPr>
+        <w:spacing w:before="300" w:after="120"/>
+        <w:pBdr>
+          <w:bottom w:val="single" w:sz="4" w:space="4" w:color="B8963E"/>
+        </w:pBdr>
+      </w:pPr>
+      <w:r>
+        <w:rPr>
+          <w:rFonts w:ascii="Georgia" w:hAnsi="Georgia"/>
+          <w:b/>
+          <w:color w:val="0B1F3A"/>
+          <w:sz w:val="24"/>
+        </w:rPr>
+        <w:t>13. Fair Market Value</w:t>
+      </w:r>
+    </w:p>
+    <w:p>
+      <w:pPr>
+        <w:spacing w:after="140" w:line="276" w:lineRule="auto"/>
+      </w:pPr>
+      <w:r>
+        <w:rPr>
+          <w:rFonts w:ascii="Calibri" w:hAnsi="Calibri"/>
+          <w:b/>
+          <w:i w:val="0"/>
+          <w:color w:val="1B2430"/>
+          <w:sz w:val="20"/>
+        </w:rPr>
+        <w:t>13. Fair Market Value.</w:t>
+      </w:r>
+      <w:r>
+        <w:rPr>
+          <w:rFonts w:ascii="Calibri" w:hAnsi="Calibri"/>
+          <w:b w:val="0"/>
+          <w:i w:val="0"/>
+          <w:color w:val="1B2430"/>
+          <w:sz w:val="20"/>
+        </w:rPr>
+        <w:t xml:space="preserve"> Where this Agreement requires a purchase at Fair Market Value, the Members shall first attempt to agree on Fair Market Value within 15 days. If they cannot agree, each Member shall, within a further 15 days, select a qualified independent business appraiser. The two appraisers shall jointly determine Fair Market Value within 30 days. If the two determinations are within 10% of each other, Fair Market Value is the average of the two. If the determinations differ by more than 10%, the two appraisers shall jointly select a third independent appraiser whose determination of Fair Market Value is final and binding. Each Member bears the cost of its own appraiser; the cost of any third appraiser is shared equally.</w:t>
+      </w:r>
+    </w:p>
+    <w:p>
+      <w:pPr>
+        <w:spacing w:before="300" w:after="120"/>
+        <w:pBdr>
+          <w:bottom w:val="single" w:sz="4" w:space="4" w:color="B8963E"/>
+        </w:pBdr>
+      </w:pPr>
+      <w:r>
+        <w:rPr>
+          <w:rFonts w:ascii="Georgia" w:hAnsi="Georgia"/>
+          <w:b/>
+          <w:color w:val="0B1F3A"/>
+          <w:sz w:val="24"/>
+        </w:rPr>
+        <w:t>14. Buy-Sell Procedure</w:t>
+      </w:r>
+    </w:p>
+    <w:p>
+      <w:pPr>
+        <w:spacing w:after="140" w:line="276" w:lineRule="auto"/>
+      </w:pPr>
+      <w:r>
+        <w:rPr>
+          <w:rFonts w:ascii="Calibri" w:hAnsi="Calibri"/>
+          <w:b/>
+          <w:i w:val="0"/>
+          <w:color w:val="1B2430"/>
+          <w:sz w:val="20"/>
+        </w:rPr>
+        <w:t>14.1 Offer Notice.</w:t>
+      </w:r>
+      <w:r>
+        <w:rPr>
+          <w:rFonts w:ascii="Calibri" w:hAnsi="Calibri"/>
+          <w:b w:val="0"/>
+          <w:i w:val="0"/>
+          <w:color w:val="1B2430"/>
+          <w:sz w:val="20"/>
+        </w:rPr>
+        <w:t xml:space="preserve"> Upon a Triggering Event other than death or Disability, or upon a Deadlock that has reached the buy-sell step, the Member invoking this Section (the “Offeror”) shall deliver written notice to the other Member (the “Offeree”) stating a single price per one percent (1%) of Percentage Interest at which the Offeror is willing either to buy the Offeree's entire Membership Interest or to sell the Offeror's entire Membership Interest to the Offeree, at the Offeree's election.</w:t>
+      </w:r>
+    </w:p>
+    <w:p>
+      <w:pPr>
+        <w:spacing w:after="140" w:line="276" w:lineRule="auto"/>
+      </w:pPr>
+      <w:r>
+        <w:rPr>
+          <w:rFonts w:ascii="Calibri" w:hAnsi="Calibri"/>
+          <w:b/>
+          <w:i w:val="0"/>
+          <w:color w:val="1B2430"/>
+          <w:sz w:val="20"/>
+        </w:rPr>
+        <w:t>14.2 Offeree Election.</w:t>
+      </w:r>
+      <w:r>
+        <w:rPr>
+          <w:rFonts w:ascii="Calibri" w:hAnsi="Calibri"/>
+          <w:b w:val="0"/>
+          <w:i w:val="0"/>
+          <w:color w:val="1B2430"/>
+          <w:sz w:val="20"/>
+        </w:rPr>
+        <w:t xml:space="preserve"> Within 30 days of the Offer Notice, the Offeree shall elect, by written notice to the Offeror, either (i) to sell the Offeree's entire Membership Interest to the Offeror at the stated price, or (ii) to purchase the Offeror's entire Membership Interest at the same stated price. Failure to elect within such period is deemed an election under clause (i).</w:t>
+      </w:r>
+    </w:p>
+    <w:p>
+      <w:pPr>
+        <w:spacing w:after="140" w:line="276" w:lineRule="auto"/>
+      </w:pPr>
+      <w:r>
+        <w:rPr>
+          <w:rFonts w:ascii="Calibri" w:hAnsi="Calibri"/>
+          <w:b/>
+          <w:i w:val="0"/>
+          <w:color w:val="1B2430"/>
+          <w:sz w:val="20"/>
+        </w:rPr>
+        <w:t>14.3 Closing.</w:t>
+      </w:r>
+      <w:r>
+        <w:rPr>
+          <w:rFonts w:ascii="Calibri" w:hAnsi="Calibri"/>
+          <w:b w:val="0"/>
+          <w:i w:val="0"/>
+          <w:color w:val="1B2430"/>
+          <w:sz w:val="20"/>
+        </w:rPr>
+        <w:t xml:space="preserve"> Closing of the purchase shall occur within 60 days of the Offeree's election or deemed election, on the payment terms set out in Section 15.</w:t>
+      </w:r>
+    </w:p>
+    <w:p>
+      <w:pPr>
+        <w:spacing w:after="140" w:line="276" w:lineRule="auto"/>
+      </w:pPr>
+      <w:r>
+        <w:rPr>
+          <w:rFonts w:ascii="Calibri" w:hAnsi="Calibri"/>
+          <w:b/>
+          <w:i w:val="0"/>
+          <w:color w:val="1B2430"/>
+          <w:sz w:val="20"/>
+        </w:rPr>
+        <w:t>14.4 Death or Disability.</w:t>
+      </w:r>
+      <w:r>
+        <w:rPr>
+          <w:rFonts w:ascii="Calibri" w:hAnsi="Calibri"/>
+          <w:b w:val="0"/>
+          <w:i w:val="0"/>
+          <w:color w:val="1B2430"/>
+          <w:sz w:val="20"/>
+        </w:rPr>
+        <w:t xml:space="preserve"> Upon the death or Disability of a Member, the other Member (or the Company, at the other Member's election) has the right, but not the obligation, exercisable by written notice within 90 days of the Triggering Event, to purchase all but not less than all of the affected Member's Membership Interest at Fair Market Value determined under Section 13, on the payment terms set out in Section 15. The Members may, but are not required to, fund this right through life or disability insurance owned by the Company or by the other Member, with premiums paid as the Members mutually agree.</w:t>
+      </w:r>
+    </w:p>
+    <w:p>
+      <w:pPr>
+        <w:spacing w:before="300" w:after="120"/>
+        <w:pBdr>
+          <w:bottom w:val="single" w:sz="4" w:space="4" w:color="B8963E"/>
+        </w:pBdr>
+      </w:pPr>
+      <w:r>
+        <w:rPr>
+          <w:rFonts w:ascii="Georgia" w:hAnsi="Georgia"/>
+          <w:b/>
+          <w:color w:val="0B1F3A"/>
+          <w:sz w:val="24"/>
+        </w:rPr>
+        <w:t>15. Payment Terms and Withdrawal</w:t>
+      </w:r>
+    </w:p>
+    <w:p>
+      <w:pPr>
+        <w:spacing w:after="140" w:line="276" w:lineRule="auto"/>
+      </w:pPr>
+      <w:r>
+        <w:rPr>
+          <w:rFonts w:ascii="Calibri" w:hAnsi="Calibri"/>
+          <w:b/>
+          <w:i w:val="0"/>
+          <w:color w:val="1B2430"/>
+          <w:sz w:val="20"/>
+        </w:rPr>
+        <w:t>15.1 Payment Terms.</w:t>
+      </w:r>
+      <w:r>
+        <w:rPr>
+          <w:rFonts w:ascii="Calibri" w:hAnsi="Calibri"/>
+          <w:b w:val="0"/>
+          <w:i w:val="0"/>
+          <w:color w:val="1B2430"/>
+          <w:sz w:val="20"/>
+        </w:rPr>
+        <w:t xml:space="preserve"> Unless the parties to a purchase under this Agreement otherwise agree in writing, the purchase price shall be paid: (i) 20% in cash at closing; and (ii) the remainder pursuant to a promissory note issued by the purchasing party, bearing interest at the applicable federal rate in effect at closing, payable in equal monthly installments of principal and interest over 36 months, and secured by a pledge of the Membership Interest being acquired. The purchasing party may prepay the note in whole or in part at any time without penalty.</w:t>
+      </w:r>
+    </w:p>
+    <w:p>
+      <w:pPr>
+        <w:spacing w:after="140" w:line="276" w:lineRule="auto"/>
+      </w:pPr>
+      <w:r>
+        <w:rPr>
+          <w:rFonts w:ascii="Calibri" w:hAnsi="Calibri"/>
+          <w:b/>
+          <w:i w:val="0"/>
+          <w:color w:val="1B2430"/>
+          <w:sz w:val="20"/>
+        </w:rPr>
+        <w:t>15.2 Withdrawal from Management.</w:t>
+      </w:r>
+      <w:r>
+        <w:rPr>
+          <w:rFonts w:ascii="Calibri" w:hAnsi="Calibri"/>
+          <w:b w:val="0"/>
+          <w:i w:val="0"/>
+          <w:color w:val="1B2430"/>
+          <w:sz w:val="20"/>
+        </w:rPr>
+        <w:t xml:space="preserve"> Effective upon the closing of any purchase of a Member's entire Membership Interest under this Agreement, the selling Member automatically ceases to be a Managing Member or Manager, has no further right to participate in the management of the Company, and shall execute such further documents as are reasonably necessary to evidence the Transfer and withdrawal.</w:t>
+      </w:r>
+    </w:p>
+    <w:p>
+      <w:pPr>
+        <w:spacing w:after="140" w:line="276" w:lineRule="auto"/>
+      </w:pPr>
+      <w:r>
+        <w:rPr>
+          <w:rFonts w:ascii="Calibri" w:hAnsi="Calibri"/>
+          <w:b/>
+          <w:i w:val="0"/>
+          <w:color w:val="1B2430"/>
+          <w:sz w:val="20"/>
+        </w:rPr>
+        <w:t>15.3 Continuing Obligations.</w:t>
+      </w:r>
+      <w:r>
+        <w:rPr>
+          <w:rFonts w:ascii="Calibri" w:hAnsi="Calibri"/>
+          <w:b w:val="0"/>
+          <w:i w:val="0"/>
+          <w:color w:val="1B2430"/>
+          <w:sz w:val="20"/>
+        </w:rPr>
+        <w:t xml:space="preserve"> The selling Member's obligations under the confidentiality, restrictive covenant, and work product provisions of this Agreement survive the closing in accordance with their terms.</w:t>
+      </w:r>
+    </w:p>
+    <w:p>
+      <w:pPr>
+        <w:spacing w:before="300" w:after="120"/>
+        <w:pBdr>
+          <w:bottom w:val="single" w:sz="4" w:space="4" w:color="B8963E"/>
+        </w:pBdr>
+      </w:pPr>
+      <w:r>
+        <w:rPr>
+          <w:rFonts w:ascii="Georgia" w:hAnsi="Georgia"/>
+          <w:b/>
+          <w:color w:val="0B1F3A"/>
+          <w:sz w:val="24"/>
+        </w:rPr>
+        <w:t>16. Duties, Exculpation, and Indemnification</w:t>
+      </w:r>
+    </w:p>
+    <w:p>
+      <w:pPr>
+        <w:spacing w:after="140" w:line="276" w:lineRule="auto"/>
+      </w:pPr>
+      <w:r>
+        <w:rPr>
+          <w:rFonts w:ascii="Calibri" w:hAnsi="Calibri"/>
+          <w:b/>
+          <w:i w:val="0"/>
+          <w:color w:val="1B2430"/>
+          <w:sz w:val="20"/>
+        </w:rPr>
+        <w:t>16.1 Duties.</w:t>
       </w:r>
       <w:r>
         <w:rPr>
@@ -1544,7 +2099,7 @@
           <w:color w:val="1B2430"/>
           <w:sz w:val="20"/>
         </w:rPr>
-        <w:t>11.2 Other Activities.</w:t>
+        <w:t>16.2 Other Activities.</w:t>
       </w:r>
       <w:r>
         <w:rPr>
@@ -1569,7 +2124,7 @@
           <w:color w:val="1B2430"/>
           <w:sz w:val="20"/>
         </w:rPr>
-        <w:t>11.3 Exculpation.</w:t>
+        <w:t>16.3 Exculpation.</w:t>
       </w:r>
       <w:r>
         <w:rPr>
@@ -1594,7 +2149,7 @@
           <w:color w:val="1B2430"/>
           <w:sz w:val="20"/>
         </w:rPr>
-        <w:t>11.4 Indemnification.</w:t>
+        <w:t>16.4 Indemnification.</w:t>
       </w:r>
       <w:r>
         <w:rPr>
@@ -1604,7 +2159,7 @@
           <w:color w:val="1B2430"/>
           <w:sz w:val="20"/>
         </w:rPr>
-        <w:t xml:space="preserve"> The Company shall indemnify each Manager and Member against any loss, claim, or expense (including reasonable attorneys' fees) arising from its service to the Company, except to the extent arising from conduct described in Section 11.3. Indemnification is payable only from Company assets, and no Member has any personal obligation in respect of it.</w:t>
+        <w:t xml:space="preserve"> The Company shall indemnify each Manager and Member against any loss, claim, or expense (including reasonable attorneys' fees) arising from its service to the Company, except to the extent arising from conduct described in Section 16.3. Indemnification is payable only from Company assets, and no Member has any personal obligation in respect of it.</w:t>
       </w:r>
     </w:p>
     <w:p>
@@ -1619,7 +2174,7 @@
           <w:color w:val="1B2430"/>
           <w:sz w:val="20"/>
         </w:rPr>
-        <w:t>11.5 Advancement.</w:t>
+        <w:t>16.5 Advancement.</w:t>
       </w:r>
       <w:r>
         <w:rPr>
@@ -1646,7 +2201,7 @@
           <w:color w:val="0B1F3A"/>
           <w:sz w:val="24"/>
         </w:rPr>
-        <w:t>12. Books, Records, and Reporting</w:t>
+        <w:t>17. Tax Distributions and Tax Matters</w:t>
       </w:r>
     </w:p>
     <w:p>
@@ -1661,7 +2216,124 @@
           <w:color w:val="1B2430"/>
           <w:sz w:val="20"/>
         </w:rPr>
-        <w:t>12.1 Books and Records.</w:t>
+        <w:t>17.1 Tax Distributions.</w:t>
+      </w:r>
+      <w:r>
+        <w:rPr>
+          <w:rFonts w:ascii="Calibri" w:hAnsi="Calibri"/>
+          <w:b w:val="0"/>
+          <w:i w:val="0"/>
+          <w:color w:val="1B2430"/>
+          <w:sz w:val="20"/>
+        </w:rPr>
+        <w:t xml:space="preserve"> To the extent the Company has sufficient Available Cash, the Company shall distribute to each Member, no later than 75 days after the end of each fiscal year, an amount sufficient to enable such Member to pay estimated and final federal and state income taxes attributable to such Member's allocable share of the Company's taxable income for that fiscal year, calculated at an assumed combined rate agreed by the Members. Tax distributions are treated as advances against, and reduce, subsequent distributions otherwise payable to that Member.</w:t>
+      </w:r>
+    </w:p>
+    <w:p>
+      <w:pPr>
+        <w:spacing w:after="140" w:line="276" w:lineRule="auto"/>
+      </w:pPr>
+      <w:r>
+        <w:rPr>
+          <w:rFonts w:ascii="Calibri" w:hAnsi="Calibri"/>
+          <w:b/>
+          <w:i w:val="0"/>
+          <w:color w:val="1B2430"/>
+          <w:sz w:val="20"/>
+        </w:rPr>
+        <w:t>17.2 Tax Classification.</w:t>
+      </w:r>
+      <w:r>
+        <w:rPr>
+          <w:rFonts w:ascii="Calibri" w:hAnsi="Calibri"/>
+          <w:b w:val="0"/>
+          <w:i w:val="0"/>
+          <w:color w:val="1B2430"/>
+          <w:sz w:val="20"/>
+        </w:rPr>
+        <w:t xml:space="preserve"> The Company shall be treated as a partnership for federal and applicable state income tax purposes unless the Members unanimously elect otherwise.</w:t>
+      </w:r>
+    </w:p>
+    <w:p>
+      <w:pPr>
+        <w:spacing w:after="140" w:line="276" w:lineRule="auto"/>
+      </w:pPr>
+      <w:r>
+        <w:rPr>
+          <w:rFonts w:ascii="Calibri" w:hAnsi="Calibri"/>
+          <w:b/>
+          <w:i w:val="0"/>
+          <w:color w:val="1B2430"/>
+          <w:sz w:val="20"/>
+        </w:rPr>
+        <w:t>17.3 Partnership Representative.</w:t>
+      </w:r>
+      <w:r>
+        <w:rPr>
+          <w:rFonts w:ascii="Calibri" w:hAnsi="Calibri"/>
+          <w:b w:val="0"/>
+          <w:i w:val="0"/>
+          <w:color w:val="1B2430"/>
+          <w:sz w:val="20"/>
+        </w:rPr>
+        <w:t xml:space="preserve"> The Members shall designate the “partnership representative” for purposes of Section 6223 of the Internal Revenue Code by mutual written agreement. The Partnership Representative shall keep the other Members reasonably informed of, and shall not settle or resolve, any material tax audit or proceeding without the other Members' consent.</w:t>
+      </w:r>
+    </w:p>
+    <w:p>
+      <w:pPr>
+        <w:spacing w:after="140" w:line="276" w:lineRule="auto"/>
+      </w:pPr>
+      <w:r>
+        <w:rPr>
+          <w:rFonts w:ascii="Calibri" w:hAnsi="Calibri"/>
+          <w:b/>
+          <w:i w:val="0"/>
+          <w:color w:val="1B2430"/>
+          <w:sz w:val="20"/>
+        </w:rPr>
+        <w:t>17.4 Tax Information.</w:t>
+      </w:r>
+      <w:r>
+        <w:rPr>
+          <w:rFonts w:ascii="Calibri" w:hAnsi="Calibri"/>
+          <w:b w:val="0"/>
+          <w:i w:val="0"/>
+          <w:color w:val="1B2430"/>
+          <w:sz w:val="20"/>
+        </w:rPr>
+        <w:t xml:space="preserve"> The Company shall furnish each Member with a Schedule K-1 and such other information as is reasonably necessary for the Member's own tax filings within 75 days after the end of each fiscal year.</w:t>
+      </w:r>
+    </w:p>
+    <w:p>
+      <w:pPr>
+        <w:spacing w:before="300" w:after="120"/>
+        <w:pBdr>
+          <w:bottom w:val="single" w:sz="4" w:space="4" w:color="B8963E"/>
+        </w:pBdr>
+      </w:pPr>
+      <w:r>
+        <w:rPr>
+          <w:rFonts w:ascii="Georgia" w:hAnsi="Georgia"/>
+          <w:b/>
+          <w:color w:val="0B1F3A"/>
+          <w:sz w:val="24"/>
+        </w:rPr>
+        <w:t>18. Books, Records, and Reporting</w:t>
+      </w:r>
+    </w:p>
+    <w:p>
+      <w:pPr>
+        <w:spacing w:after="140" w:line="276" w:lineRule="auto"/>
+      </w:pPr>
+      <w:r>
+        <w:rPr>
+          <w:rFonts w:ascii="Calibri" w:hAnsi="Calibri"/>
+          <w:b/>
+          <w:i w:val="0"/>
+          <w:color w:val="1B2430"/>
+          <w:sz w:val="20"/>
+        </w:rPr>
+        <w:t>18.1 Books and Records.</w:t>
       </w:r>
       <w:r>
         <w:rPr>
@@ -1686,7 +2358,7 @@
           <w:color w:val="1B2430"/>
           <w:sz w:val="20"/>
         </w:rPr>
-        <w:t>12.2 Inspection.</w:t>
+        <w:t>18.2 Inspection.</w:t>
       </w:r>
       <w:r>
         <w:rPr>
@@ -1711,7 +2383,7 @@
           <w:color w:val="1B2430"/>
           <w:sz w:val="20"/>
         </w:rPr>
-        <w:t>12.3 Reporting.</w:t>
+        <w:t>18.3 Reporting.</w:t>
       </w:r>
       <w:r>
         <w:rPr>
@@ -1736,7 +2408,7 @@
           <w:color w:val="1B2430"/>
           <w:sz w:val="20"/>
         </w:rPr>
-        <w:t>12.4 Tax Information.</w:t>
+        <w:t>18.4 Tax Information.</w:t>
       </w:r>
       <w:r>
         <w:rPr>
@@ -1761,7 +2433,7 @@
           <w:color w:val="1B2430"/>
           <w:sz w:val="20"/>
         </w:rPr>
-        <w:t>12.5 Confidentiality.</w:t>
+        <w:t>18.5 Confidentiality.</w:t>
       </w:r>
       <w:r>
         <w:rPr>
@@ -1788,7 +2460,7 @@
           <w:color w:val="0B1F3A"/>
           <w:sz w:val="24"/>
         </w:rPr>
-        <w:t>13. Confidentiality</w:t>
+        <w:t>19. Confidentiality</w:t>
       </w:r>
     </w:p>
     <w:p>
@@ -1803,7 +2475,7 @@
           <w:color w:val="1B2430"/>
           <w:sz w:val="20"/>
         </w:rPr>
-        <w:t>13.1 Definition.</w:t>
+        <w:t>19.1 Definition.</w:t>
       </w:r>
       <w:r>
         <w:rPr>
@@ -1828,7 +2500,7 @@
           <w:color w:val="1B2430"/>
           <w:sz w:val="20"/>
         </w:rPr>
-        <w:t>13.2 Obligations.</w:t>
+        <w:t>19.2 Obligations.</w:t>
       </w:r>
       <w:r>
         <w:rPr>
@@ -1853,7 +2525,7 @@
           <w:color w:val="1B2430"/>
           <w:sz w:val="20"/>
         </w:rPr>
-        <w:t>13.3 Exclusions.</w:t>
+        <w:t>19.3 Exclusions.</w:t>
       </w:r>
       <w:r>
         <w:rPr>
@@ -1878,7 +2550,7 @@
           <w:color w:val="1B2430"/>
           <w:sz w:val="20"/>
         </w:rPr>
-        <w:t>13.4 Compelled Disclosure.</w:t>
+        <w:t>19.4 Compelled Disclosure.</w:t>
       </w:r>
       <w:r>
         <w:rPr>
@@ -1903,7 +2575,7 @@
           <w:color w:val="1B2430"/>
           <w:sz w:val="20"/>
         </w:rPr>
-        <w:t>13.5 Term.</w:t>
+        <w:t>19.5 Term.</w:t>
       </w:r>
       <w:r>
         <w:rPr>
@@ -1928,7 +2600,7 @@
           <w:color w:val="1B2430"/>
           <w:sz w:val="20"/>
         </w:rPr>
-        <w:t>13.6 Return.</w:t>
+        <w:t>19.6 Return.</w:t>
       </w:r>
       <w:r>
         <w:rPr>
@@ -1955,7 +2627,7 @@
           <w:color w:val="0B1F3A"/>
           <w:sz w:val="24"/>
         </w:rPr>
-        <w:t>14. Confidentiality and Post-Departure Terms</w:t>
+        <w:t>20. Work Product and Intellectual Property</w:t>
       </w:r>
     </w:p>
     <w:p>
@@ -1970,7 +2642,124 @@
           <w:color w:val="1B2430"/>
           <w:sz w:val="20"/>
         </w:rPr>
-        <w:t>14. Confidentiality.</w:t>
+        <w:t>20.1 Ownership.</w:t>
+      </w:r>
+      <w:r>
+        <w:rPr>
+          <w:rFonts w:ascii="Calibri" w:hAnsi="Calibri"/>
+          <w:b w:val="0"/>
+          <w:i w:val="0"/>
+          <w:color w:val="1B2430"/>
+          <w:sz w:val="20"/>
+        </w:rPr>
+        <w:t xml:space="preserve"> All frameworks, deal structures, financial models, governance templates, methodologies, software, written materials, and other work product developed by a Member in connection with the Company's business is owned by the Company.</w:t>
+      </w:r>
+    </w:p>
+    <w:p>
+      <w:pPr>
+        <w:spacing w:after="140" w:line="276" w:lineRule="auto"/>
+      </w:pPr>
+      <w:r>
+        <w:rPr>
+          <w:rFonts w:ascii="Calibri" w:hAnsi="Calibri"/>
+          <w:b/>
+          <w:i w:val="0"/>
+          <w:color w:val="1B2430"/>
+          <w:sz w:val="20"/>
+        </w:rPr>
+        <w:t>20.2 Present Assignment.</w:t>
+      </w:r>
+      <w:r>
+        <w:rPr>
+          <w:rFonts w:ascii="Calibri" w:hAnsi="Calibri"/>
+          <w:b w:val="0"/>
+          <w:i w:val="0"/>
+          <w:color w:val="1B2430"/>
+          <w:sz w:val="20"/>
+        </w:rPr>
+        <w:t xml:space="preserve"> Each Member hereby assigns to the Company all right, title, and interest in and to such work product, including all intellectual property rights therein, effective upon creation.</w:t>
+      </w:r>
+    </w:p>
+    <w:p>
+      <w:pPr>
+        <w:spacing w:after="140" w:line="276" w:lineRule="auto"/>
+      </w:pPr>
+      <w:r>
+        <w:rPr>
+          <w:rFonts w:ascii="Calibri" w:hAnsi="Calibri"/>
+          <w:b/>
+          <w:i w:val="0"/>
+          <w:color w:val="1B2430"/>
+          <w:sz w:val="20"/>
+        </w:rPr>
+        <w:t>20.3 Further Assurances.</w:t>
+      </w:r>
+      <w:r>
+        <w:rPr>
+          <w:rFonts w:ascii="Calibri" w:hAnsi="Calibri"/>
+          <w:b w:val="0"/>
+          <w:i w:val="0"/>
+          <w:color w:val="1B2430"/>
+          <w:sz w:val="20"/>
+        </w:rPr>
+        <w:t xml:space="preserve"> Each Member shall execute such documents and take such further actions as are reasonably necessary to perfect, record, and enforce the Company's ownership under this Section.</w:t>
+      </w:r>
+    </w:p>
+    <w:p>
+      <w:pPr>
+        <w:spacing w:after="140" w:line="276" w:lineRule="auto"/>
+      </w:pPr>
+      <w:r>
+        <w:rPr>
+          <w:rFonts w:ascii="Calibri" w:hAnsi="Calibri"/>
+          <w:b/>
+          <w:i w:val="0"/>
+          <w:color w:val="1B2430"/>
+          <w:sz w:val="20"/>
+        </w:rPr>
+        <w:t>20.4 Pre-Existing Materials.</w:t>
+      </w:r>
+      <w:r>
+        <w:rPr>
+          <w:rFonts w:ascii="Calibri" w:hAnsi="Calibri"/>
+          <w:b w:val="0"/>
+          <w:i w:val="0"/>
+          <w:color w:val="1B2430"/>
+          <w:sz w:val="20"/>
+        </w:rPr>
+        <w:t xml:space="preserve"> Materials owned by a Member prior to the Effective Date, and identified in writing to the other Members, are not assigned under this Section; the assigning Member grants the Company a non-exclusive, perpetual, royalty-free licence to use such materials in the conduct of the Company's business.</w:t>
+      </w:r>
+    </w:p>
+    <w:p>
+      <w:pPr>
+        <w:spacing w:before="300" w:after="120"/>
+        <w:pBdr>
+          <w:bottom w:val="single" w:sz="4" w:space="4" w:color="B8963E"/>
+        </w:pBdr>
+      </w:pPr>
+      <w:r>
+        <w:rPr>
+          <w:rFonts w:ascii="Georgia" w:hAnsi="Georgia"/>
+          <w:b/>
+          <w:color w:val="0B1F3A"/>
+          <w:sz w:val="24"/>
+        </w:rPr>
+        <w:t>21. Confidentiality and Post-Departure Terms</w:t>
+      </w:r>
+    </w:p>
+    <w:p>
+      <w:pPr>
+        <w:spacing w:after="140" w:line="276" w:lineRule="auto"/>
+      </w:pPr>
+      <w:r>
+        <w:rPr>
+          <w:rFonts w:ascii="Calibri" w:hAnsi="Calibri"/>
+          <w:b/>
+          <w:i w:val="0"/>
+          <w:color w:val="1B2430"/>
+          <w:sz w:val="20"/>
+        </w:rPr>
+        <w:t>21. Confidentiality.</w:t>
       </w:r>
       <w:r>
         <w:rPr>
@@ -1997,7 +2786,7 @@
           <w:color w:val="0B1F3A"/>
           <w:sz w:val="24"/>
         </w:rPr>
-        <w:t>15. Dissolution and Winding Up</w:t>
+        <w:t>22. Dissolution and Winding Up</w:t>
       </w:r>
     </w:p>
     <w:p>
@@ -2012,7 +2801,7 @@
           <w:color w:val="1B2430"/>
           <w:sz w:val="20"/>
         </w:rPr>
-        <w:t>15.1 Dissolution.</w:t>
+        <w:t>22.1 Dissolution.</w:t>
       </w:r>
       <w:r>
         <w:rPr>
@@ -2037,7 +2826,7 @@
           <w:color w:val="1B2430"/>
           <w:sz w:val="20"/>
         </w:rPr>
-        <w:t>15.2 Winding Up.</w:t>
+        <w:t>22.2 Winding Up.</w:t>
       </w:r>
       <w:r>
         <w:rPr>
@@ -2062,7 +2851,7 @@
           <w:color w:val="1B2430"/>
           <w:sz w:val="20"/>
         </w:rPr>
-        <w:t>15.3 No Deficit Restoration.</w:t>
+        <w:t>22.3 No Deficit Restoration.</w:t>
       </w:r>
       <w:r>
         <w:rPr>
@@ -2087,7 +2876,7 @@
           <w:color w:val="1B2430"/>
           <w:sz w:val="20"/>
         </w:rPr>
-        <w:t>15.4 Termination.</w:t>
+        <w:t>22.4 Termination.</w:t>
       </w:r>
       <w:r>
         <w:rPr>
@@ -2114,7 +2903,7 @@
           <w:color w:val="0B1F3A"/>
           <w:sz w:val="24"/>
         </w:rPr>
-        <w:t>16. Governing Law and Dispute Resolution</w:t>
+        <w:t>23. Governing Law and Dispute Resolution</w:t>
       </w:r>
     </w:p>
     <w:p>
@@ -2129,7 +2918,7 @@
           <w:color w:val="1B2430"/>
           <w:sz w:val="20"/>
         </w:rPr>
-        <w:t>16.1 Governing Law.</w:t>
+        <w:t>23.1 Governing Law.</w:t>
       </w:r>
       <w:r>
         <w:rPr>
@@ -2154,7 +2943,7 @@
           <w:color w:val="1B2430"/>
           <w:sz w:val="20"/>
         </w:rPr>
-        <w:t>16.2 Escalation.</w:t>
+        <w:t>23.2 Escalation.</w:t>
       </w:r>
       <w:r>
         <w:rPr>
@@ -2179,7 +2968,7 @@
           <w:color w:val="1B2430"/>
           <w:sz w:val="20"/>
         </w:rPr>
-        <w:t>16.3 Arbitration.</w:t>
+        <w:t>23.3 Arbitration.</w:t>
       </w:r>
       <w:r>
         <w:rPr>
@@ -2189,7 +2978,7 @@
           <w:color w:val="1B2430"/>
           <w:sz w:val="20"/>
         </w:rPr>
-        <w:t xml:space="preserve"> Any dispute not resolved under Section 16.2 shall be finally resolved by binding arbitration before a single arbitrator under the rules of JAMS, seated in the State of Texas. Judgment on the award may be entered in any court of competent jurisdiction.</w:t>
+        <w:t xml:space="preserve"> Any dispute not resolved under Section 23.2 shall be finally resolved by binding arbitration before a single arbitrator under the rules of JAMS, seated in the State of Texas. Judgment on the award may be entered in any court of competent jurisdiction.</w:t>
       </w:r>
     </w:p>
     <w:p>
@@ -2204,7 +2993,7 @@
           <w:color w:val="1B2430"/>
           <w:sz w:val="20"/>
         </w:rPr>
-        <w:t>16.4 Exceptions.</w:t>
+        <w:t>23.4 Exceptions.</w:t>
       </w:r>
       <w:r>
         <w:rPr>
@@ -2229,7 +3018,7 @@
           <w:color w:val="1B2430"/>
           <w:sz w:val="20"/>
         </w:rPr>
-        <w:t>16.5 Fees.</w:t>
+        <w:t>23.5 Fees.</w:t>
       </w:r>
       <w:r>
         <w:rPr>
@@ -2254,7 +3043,7 @@
           <w:color w:val="1B2430"/>
           <w:sz w:val="20"/>
         </w:rPr>
-        <w:t>16.6 Confidentiality of Proceedings.</w:t>
+        <w:t>23.6 Confidentiality of Proceedings.</w:t>
       </w:r>
       <w:r>
         <w:rPr>
@@ -2811,7 +3600,23 @@
           <w:color w:val="1B2430"/>
           <w:sz w:val="20"/>
         </w:rPr>
-        <w:t>Distributions: MANDATORY tax review: confirm the waterfall, the promote, and the tax-distribution provision are consistent with the intended tax treatment and the allocation provisions. Run the waterfall on at least one downside case before signature.</w:t>
+        <w:t>Distributions: MANDATORY tax review: confirm the waterfall, the catch-up, the promote, and the tax-distribution provision are consistent with the intended tax treatment and the allocation provisions. Confirm whether the catch-up is intended to be full or partial — this is where most of the negotiation actually sits and the drafting above states a full catch-up. Confirm whether the waterfall runs deal-by-deal or across the whole venture, which decides whether the clawback is ever reachable. Run the waterfall on at least two real distribution scenarios before adoption.</w:t>
+      </w:r>
+    </w:p>
+    <w:p>
+      <w:pPr>
+        <w:pStyle w:val="ListBullet"/>
+        <w:spacing w:after="80"/>
+      </w:pPr>
+      <w:r>
+        <w:rPr>
+          <w:rFonts w:ascii="Calibri" w:hAnsi="Calibri"/>
+          <w:b w:val="0"/>
+          <w:i w:val="0"/>
+          <w:color w:val="1B2430"/>
+          <w:sz w:val="20"/>
+        </w:rPr>
+        <w:t>Titles and Authority: Confirm the titles actually used on cards, signature blocks, and filings are covered — an unlisted title is the one that causes the problem.</w:t>
       </w:r>
     </w:p>
     <w:p>
@@ -2907,7 +3712,87 @@
           <w:color w:val="1B2430"/>
           <w:sz w:val="20"/>
         </w:rPr>
+        <w:t>Triggering Events: Confirm the Disability definition against any disability policy the Company or the Members carry — a mismatch leaves a funding gap precisely when the obligation triggers. Confirm the divorce trigger's interaction with community-property law in the governing jurisdiction, and whether spousal consents should be obtained at signing. Confirm whether “moral turpitude” is enforceable as a standard in the governing jurisdiction.</w:t>
+      </w:r>
+    </w:p>
+    <w:p>
+      <w:pPr>
+        <w:pStyle w:val="ListBullet"/>
+        <w:spacing w:after="80"/>
+      </w:pPr>
+      <w:r>
+        <w:rPr>
+          <w:rFonts w:ascii="Calibri" w:hAnsi="Calibri"/>
+          <w:b w:val="0"/>
+          <w:i w:val="0"/>
+          <w:color w:val="1B2430"/>
+          <w:sz w:val="20"/>
+        </w:rPr>
+        <w:t>Fair Market Value: Confirm whether the appraiser is instructed to apply, or to disregard, discounts for lack of marketability and lack of control. This single instruction can move the price by a third and is the most commonly litigated omission in buy-sell provisions. The clause below is deliberately silent so the instruction is a conscious choice.</w:t>
+      </w:r>
+    </w:p>
+    <w:p>
+      <w:pPr>
+        <w:pStyle w:val="ListBullet"/>
+        <w:spacing w:after="80"/>
+      </w:pPr>
+      <w:r>
+        <w:rPr>
+          <w:rFonts w:ascii="Calibri" w:hAnsi="Calibri"/>
+          <w:b w:val="0"/>
+          <w:i w:val="0"/>
+          <w:color w:val="1B2430"/>
+          <w:sz w:val="20"/>
+        </w:rPr>
+        <w:t>Buy-Sell Procedure: Confirm both parties can realistically fund a purchase at a plausible price. Confirm the deemed-election default on failure to respond is intended, and consider whether the offeror should be required to demonstrate financing before serving the notice.</w:t>
+      </w:r>
+    </w:p>
+    <w:p>
+      <w:pPr>
+        <w:pStyle w:val="ListBullet"/>
+        <w:spacing w:after="80"/>
+      </w:pPr>
+      <w:r>
+        <w:rPr>
+          <w:rFonts w:ascii="Calibri" w:hAnsi="Calibri"/>
+          <w:b w:val="0"/>
+          <w:i w:val="0"/>
+          <w:color w:val="1B2430"/>
+          <w:sz w:val="20"/>
+        </w:rPr>
+        <w:t>Payment Terms and Withdrawal: Confirm the note terms against the applicable federal rate rules so the note is not recharacterised as carrying imputed interest, and confirm the pledge is perfected under the governing jurisdiction's Article 9. Consider whether the note should accelerate on a subsequent sale of the Company, and whether a pledge of the interest being purchased is adequate security.</w:t>
+      </w:r>
+    </w:p>
+    <w:p>
+      <w:pPr>
+        <w:pStyle w:val="ListBullet"/>
+        <w:spacing w:after="80"/>
+      </w:pPr>
+      <w:r>
+        <w:rPr>
+          <w:rFonts w:ascii="Calibri" w:hAnsi="Calibri"/>
+          <w:b w:val="0"/>
+          <w:i w:val="0"/>
+          <w:color w:val="1B2430"/>
+          <w:sz w:val="20"/>
+        </w:rPr>
         <w:t>Duties, Exculpation, and Indemnification: MANDATORY: confirm what may and may not be waived under the applicable synthetic entity statute placeholder — this varies significantly by state, and a waiver that is effective in Delaware may not be elsewhere. Confirm the indemnification and advancement provisions are consistent with the Company's insurance.</w:t>
+      </w:r>
+    </w:p>
+    <w:p>
+      <w:pPr>
+        <w:pStyle w:val="ListBullet"/>
+        <w:spacing w:after="80"/>
+      </w:pPr>
+      <w:r>
+        <w:rPr>
+          <w:rFonts w:ascii="Calibri" w:hAnsi="Calibri"/>
+          <w:b w:val="0"/>
+          <w:i w:val="0"/>
+          <w:color w:val="1B2430"/>
+          <w:sz w:val="20"/>
+        </w:rPr>
+        <w:t>Tax Distributions and Tax Matters: Confirm the assumed tax rate and whether it should be the highest marginal combined rate applicable to any Member. Confirm the timing works against estimated-payment deadlines rather than only the annual filing date. Confirm the Partnership Representative designation and the limits on that person's authority to settle an audit.</w:t>
       </w:r>
     </w:p>
     <w:p>
@@ -2940,6 +3825,22 @@
           <w:sz w:val="20"/>
         </w:rPr>
         <w:t>Confidentiality: Confirm the trade-secret carve-out from the term limit is consistent with the State of Texas law, and that the compelled-disclosure procedure is workable.</w:t>
+      </w:r>
+    </w:p>
+    <w:p>
+      <w:pPr>
+        <w:pStyle w:val="ListBullet"/>
+        <w:spacing w:after="80"/>
+      </w:pPr>
+      <w:r>
+        <w:rPr>
+          <w:rFonts w:ascii="Calibri" w:hAnsi="Calibri"/>
+          <w:b w:val="0"/>
+          <w:i w:val="0"/>
+          <w:color w:val="1B2430"/>
+          <w:sz w:val="20"/>
+        </w:rPr>
+        <w:t>Work Product and Intellectual Property: Confirm whether any Member is contributing pre-existing intellectual property that should be licensed rather than assigned, and schedule it. Confirm the present-assignment language is effective in the governing jurisdiction — an agreement to assign in the future is materially weaker than an assignment.</w:t>
       </w:r>
     </w:p>
     <w:p>
@@ -3023,13 +3924,13 @@
         <w:tblLook w:firstColumn="1" w:firstRow="1" w:lastColumn="0" w:lastRow="0" w:noHBand="0" w:noVBand="1" w:val="04A0"/>
       </w:tblPr>
       <w:tblGrid>
-        <w:gridCol w:w="4171"/>
-        <w:gridCol w:w="5909"/>
+        <w:gridCol w:w="5320"/>
+        <w:gridCol w:w="4760"/>
       </w:tblGrid>
       <w:tr>
         <w:tc>
           <w:tcPr>
-            <w:tcW w:type="dxa" w:w="4171"/>
+            <w:tcW w:type="dxa" w:w="5320"/>
             <w:vAlign w:val="center"/>
             <w:shd w:fill="0B1F3A"/>
           </w:tcPr>
@@ -3048,7 +3949,7 @@
         </w:tc>
         <w:tc>
           <w:tcPr>
-            <w:tcW w:type="dxa" w:w="5909"/>
+            <w:tcW w:type="dxa" w:w="4760"/>
             <w:vAlign w:val="center"/>
             <w:shd w:fill="0B1F3A"/>
           </w:tcPr>
@@ -3069,7 +3970,7 @@
       <w:tr>
         <w:tc>
           <w:tcPr>
-            <w:tcW w:type="dxa" w:w="4171"/>
+            <w:tcW w:type="dxa" w:w="5320"/>
             <w:vAlign w:val="center"/>
           </w:tcPr>
           <w:p>
@@ -3087,7 +3988,7 @@
         </w:tc>
         <w:tc>
           <w:tcPr>
-            <w:tcW w:type="dxa" w:w="5909"/>
+            <w:tcW w:type="dxa" w:w="4760"/>
             <w:vAlign w:val="center"/>
           </w:tcPr>
           <w:p>
@@ -3107,7 +4008,7 @@
       <w:tr>
         <w:tc>
           <w:tcPr>
-            <w:tcW w:type="dxa" w:w="4171"/>
+            <w:tcW w:type="dxa" w:w="5320"/>
             <w:vAlign w:val="center"/>
           </w:tcPr>
           <w:p>
@@ -3125,7 +4026,7 @@
         </w:tc>
         <w:tc>
           <w:tcPr>
-            <w:tcW w:type="dxa" w:w="5909"/>
+            <w:tcW w:type="dxa" w:w="4760"/>
             <w:vAlign w:val="center"/>
           </w:tcPr>
           <w:p>
@@ -3145,7 +4046,7 @@
       <w:tr>
         <w:tc>
           <w:tcPr>
-            <w:tcW w:type="dxa" w:w="4171"/>
+            <w:tcW w:type="dxa" w:w="5320"/>
             <w:vAlign w:val="center"/>
           </w:tcPr>
           <w:p>
@@ -3163,7 +4064,7 @@
         </w:tc>
         <w:tc>
           <w:tcPr>
-            <w:tcW w:type="dxa" w:w="5909"/>
+            <w:tcW w:type="dxa" w:w="4760"/>
             <w:vAlign w:val="center"/>
           </w:tcPr>
           <w:p>
@@ -3183,7 +4084,159 @@
       <w:tr>
         <w:tc>
           <w:tcPr>
-            <w:tcW w:type="dxa" w:w="4171"/>
+            <w:tcW w:type="dxa" w:w="5320"/>
+            <w:vAlign w:val="center"/>
+          </w:tcPr>
+          <w:p>
+            <w:r>
+              <w:rPr>
+                <w:rFonts w:ascii="Calibri" w:hAnsi="Calibri"/>
+                <w:b w:val="0"/>
+                <w:i w:val="0"/>
+                <w:color w:val="1B2430"/>
+                <w:sz w:val="19"/>
+              </w:rPr>
+              <w:t>Cash due at closing on a buy-out</w:t>
+            </w:r>
+          </w:p>
+        </w:tc>
+        <w:tc>
+          <w:tcPr>
+            <w:tcW w:type="dxa" w:w="4760"/>
+            <w:vAlign w:val="center"/>
+          </w:tcPr>
+          <w:p>
+            <w:r>
+              <w:rPr>
+                <w:rFonts w:ascii="Calibri" w:hAnsi="Calibri"/>
+                <w:b w:val="0"/>
+                <w:i w:val="0"/>
+                <w:color w:val="1B2430"/>
+                <w:sz w:val="19"/>
+              </w:rPr>
+              <w:t>20%</w:t>
+            </w:r>
+          </w:p>
+        </w:tc>
+      </w:tr>
+      <w:tr>
+        <w:tc>
+          <w:tcPr>
+            <w:tcW w:type="dxa" w:w="5320"/>
+            <w:vAlign w:val="center"/>
+          </w:tcPr>
+          <w:p>
+            <w:r>
+              <w:rPr>
+                <w:rFonts w:ascii="Calibri" w:hAnsi="Calibri"/>
+                <w:b w:val="0"/>
+                <w:i w:val="0"/>
+                <w:color w:val="1B2430"/>
+                <w:sz w:val="19"/>
+              </w:rPr>
+              <w:t>Buy-out note term (months)</w:t>
+            </w:r>
+          </w:p>
+        </w:tc>
+        <w:tc>
+          <w:tcPr>
+            <w:tcW w:type="dxa" w:w="4760"/>
+            <w:vAlign w:val="center"/>
+          </w:tcPr>
+          <w:p>
+            <w:r>
+              <w:rPr>
+                <w:rFonts w:ascii="Calibri" w:hAnsi="Calibri"/>
+                <w:b w:val="0"/>
+                <w:i w:val="0"/>
+                <w:color w:val="1B2430"/>
+                <w:sz w:val="19"/>
+              </w:rPr>
+              <w:t>36</w:t>
+            </w:r>
+          </w:p>
+        </w:tc>
+      </w:tr>
+      <w:tr>
+        <w:tc>
+          <w:tcPr>
+            <w:tcW w:type="dxa" w:w="5320"/>
+            <w:vAlign w:val="center"/>
+          </w:tcPr>
+          <w:p>
+            <w:r>
+              <w:rPr>
+                <w:rFonts w:ascii="Calibri" w:hAnsi="Calibri"/>
+                <w:b w:val="0"/>
+                <w:i w:val="0"/>
+                <w:color w:val="1B2430"/>
+                <w:sz w:val="19"/>
+              </w:rPr>
+              <w:t>Buy-sell closing window (days)</w:t>
+            </w:r>
+          </w:p>
+        </w:tc>
+        <w:tc>
+          <w:tcPr>
+            <w:tcW w:type="dxa" w:w="4760"/>
+            <w:vAlign w:val="center"/>
+          </w:tcPr>
+          <w:p>
+            <w:r>
+              <w:rPr>
+                <w:rFonts w:ascii="Calibri" w:hAnsi="Calibri"/>
+                <w:b w:val="0"/>
+                <w:i w:val="0"/>
+                <w:color w:val="1B2430"/>
+                <w:sz w:val="19"/>
+              </w:rPr>
+              <w:t>60</w:t>
+            </w:r>
+          </w:p>
+        </w:tc>
+      </w:tr>
+      <w:tr>
+        <w:tc>
+          <w:tcPr>
+            <w:tcW w:type="dxa" w:w="5320"/>
+            <w:vAlign w:val="center"/>
+          </w:tcPr>
+          <w:p>
+            <w:r>
+              <w:rPr>
+                <w:rFonts w:ascii="Calibri" w:hAnsi="Calibri"/>
+                <w:b w:val="0"/>
+                <w:i w:val="0"/>
+                <w:color w:val="1B2430"/>
+                <w:sz w:val="19"/>
+              </w:rPr>
+              <w:t>Buy-sell election window (days)</w:t>
+            </w:r>
+          </w:p>
+        </w:tc>
+        <w:tc>
+          <w:tcPr>
+            <w:tcW w:type="dxa" w:w="4760"/>
+            <w:vAlign w:val="center"/>
+          </w:tcPr>
+          <w:p>
+            <w:r>
+              <w:rPr>
+                <w:rFonts w:ascii="Calibri" w:hAnsi="Calibri"/>
+                <w:b w:val="0"/>
+                <w:i w:val="0"/>
+                <w:color w:val="1B2430"/>
+                <w:sz w:val="19"/>
+              </w:rPr>
+              <w:t>30</w:t>
+            </w:r>
+          </w:p>
+        </w:tc>
+      </w:tr>
+      <w:tr>
+        <w:tc>
+          <w:tcPr>
+            <w:tcW w:type="dxa" w:w="5320"/>
             <w:vAlign w:val="center"/>
           </w:tcPr>
           <w:p>
@@ -3201,7 +4254,7 @@
         </w:tc>
         <w:tc>
           <w:tcPr>
-            <w:tcW w:type="dxa" w:w="5909"/>
+            <w:tcW w:type="dxa" w:w="4760"/>
             <w:vAlign w:val="center"/>
           </w:tcPr>
           <w:p>
@@ -3221,7 +4274,7 @@
       <w:tr>
         <w:tc>
           <w:tcPr>
-            <w:tcW w:type="dxa" w:w="4171"/>
+            <w:tcW w:type="dxa" w:w="5320"/>
             <w:vAlign w:val="center"/>
           </w:tcPr>
           <w:p>
@@ -3239,7 +4292,7 @@
         </w:tc>
         <w:tc>
           <w:tcPr>
-            <w:tcW w:type="dxa" w:w="5909"/>
+            <w:tcW w:type="dxa" w:w="4760"/>
             <w:vAlign w:val="center"/>
           </w:tcPr>
           <w:p>
@@ -3259,7 +4312,159 @@
       <w:tr>
         <w:tc>
           <w:tcPr>
-            <w:tcW w:type="dxa" w:w="4171"/>
+            <w:tcW w:type="dxa" w:w="5320"/>
+            <w:vAlign w:val="center"/>
+          </w:tcPr>
+          <w:p>
+            <w:r>
+              <w:rPr>
+                <w:rFonts w:ascii="Calibri" w:hAnsi="Calibri"/>
+                <w:b w:val="0"/>
+                <w:i w:val="0"/>
+                <w:color w:val="1B2430"/>
+                <w:sz w:val="19"/>
+              </w:rPr>
+              <w:t>Days to exercise the purchase right on a triggering event</w:t>
+            </w:r>
+          </w:p>
+        </w:tc>
+        <w:tc>
+          <w:tcPr>
+            <w:tcW w:type="dxa" w:w="4760"/>
+            <w:vAlign w:val="center"/>
+          </w:tcPr>
+          <w:p>
+            <w:r>
+              <w:rPr>
+                <w:rFonts w:ascii="Calibri" w:hAnsi="Calibri"/>
+                <w:b w:val="0"/>
+                <w:i w:val="0"/>
+                <w:color w:val="1B2430"/>
+                <w:sz w:val="19"/>
+              </w:rPr>
+              <w:t>90</w:t>
+            </w:r>
+          </w:p>
+        </w:tc>
+      </w:tr>
+      <w:tr>
+        <w:tc>
+          <w:tcPr>
+            <w:tcW w:type="dxa" w:w="5320"/>
+            <w:vAlign w:val="center"/>
+          </w:tcPr>
+          <w:p>
+            <w:r>
+              <w:rPr>
+                <w:rFonts w:ascii="Calibri" w:hAnsi="Calibri"/>
+                <w:b w:val="0"/>
+                <w:i w:val="0"/>
+                <w:color w:val="1B2430"/>
+                <w:sz w:val="19"/>
+              </w:rPr>
+              <w:t>Disability — days within the trailing window</w:t>
+            </w:r>
+          </w:p>
+        </w:tc>
+        <w:tc>
+          <w:tcPr>
+            <w:tcW w:type="dxa" w:w="4760"/>
+            <w:vAlign w:val="center"/>
+          </w:tcPr>
+          <w:p>
+            <w:r>
+              <w:rPr>
+                <w:rFonts w:ascii="Calibri" w:hAnsi="Calibri"/>
+                <w:b w:val="0"/>
+                <w:i w:val="0"/>
+                <w:color w:val="1B2430"/>
+                <w:sz w:val="19"/>
+              </w:rPr>
+              <w:t>120</w:t>
+            </w:r>
+          </w:p>
+        </w:tc>
+      </w:tr>
+      <w:tr>
+        <w:tc>
+          <w:tcPr>
+            <w:tcW w:type="dxa" w:w="5320"/>
+            <w:vAlign w:val="center"/>
+          </w:tcPr>
+          <w:p>
+            <w:r>
+              <w:rPr>
+                <w:rFonts w:ascii="Calibri" w:hAnsi="Calibri"/>
+                <w:b w:val="0"/>
+                <w:i w:val="0"/>
+                <w:color w:val="1B2430"/>
+                <w:sz w:val="19"/>
+              </w:rPr>
+              <w:t>Disability — consecutive days</w:t>
+            </w:r>
+          </w:p>
+        </w:tc>
+        <w:tc>
+          <w:tcPr>
+            <w:tcW w:type="dxa" w:w="4760"/>
+            <w:vAlign w:val="center"/>
+          </w:tcPr>
+          <w:p>
+            <w:r>
+              <w:rPr>
+                <w:rFonts w:ascii="Calibri" w:hAnsi="Calibri"/>
+                <w:b w:val="0"/>
+                <w:i w:val="0"/>
+                <w:color w:val="1B2430"/>
+                <w:sz w:val="19"/>
+              </w:rPr>
+              <w:t>90</w:t>
+            </w:r>
+          </w:p>
+        </w:tc>
+      </w:tr>
+      <w:tr>
+        <w:tc>
+          <w:tcPr>
+            <w:tcW w:type="dxa" w:w="5320"/>
+            <w:vAlign w:val="center"/>
+          </w:tcPr>
+          <w:p>
+            <w:r>
+              <w:rPr>
+                <w:rFonts w:ascii="Calibri" w:hAnsi="Calibri"/>
+                <w:b w:val="0"/>
+                <w:i w:val="0"/>
+                <w:color w:val="1B2430"/>
+                <w:sz w:val="19"/>
+              </w:rPr>
+              <w:t>Disability — trailing window (days)</w:t>
+            </w:r>
+          </w:p>
+        </w:tc>
+        <w:tc>
+          <w:tcPr>
+            <w:tcW w:type="dxa" w:w="4760"/>
+            <w:vAlign w:val="center"/>
+          </w:tcPr>
+          <w:p>
+            <w:r>
+              <w:rPr>
+                <w:rFonts w:ascii="Calibri" w:hAnsi="Calibri"/>
+                <w:b w:val="0"/>
+                <w:i w:val="0"/>
+                <w:color w:val="1B2430"/>
+                <w:sz w:val="19"/>
+              </w:rPr>
+              <w:t>180</w:t>
+            </w:r>
+          </w:p>
+        </w:tc>
+      </w:tr>
+      <w:tr>
+        <w:tc>
+          <w:tcPr>
+            <w:tcW w:type="dxa" w:w="5320"/>
             <w:vAlign w:val="center"/>
           </w:tcPr>
           <w:p>
@@ -3277,7 +4482,7 @@
         </w:tc>
         <w:tc>
           <w:tcPr>
-            <w:tcW w:type="dxa" w:w="5909"/>
+            <w:tcW w:type="dxa" w:w="4760"/>
             <w:vAlign w:val="center"/>
           </w:tcPr>
           <w:p>
@@ -3297,7 +4502,159 @@
       <w:tr>
         <w:tc>
           <w:tcPr>
-            <w:tcW w:type="dxa" w:w="4171"/>
+            <w:tcW w:type="dxa" w:w="5320"/>
+            <w:vAlign w:val="center"/>
+          </w:tcPr>
+          <w:p>
+            <w:r>
+              <w:rPr>
+                <w:rFonts w:ascii="Calibri" w:hAnsi="Calibri"/>
+                <w:b w:val="0"/>
+                <w:i w:val="0"/>
+                <w:color w:val="1B2430"/>
+                <w:sz w:val="19"/>
+              </w:rPr>
+              <w:t>Days for the members to agree on value</w:t>
+            </w:r>
+          </w:p>
+        </w:tc>
+        <w:tc>
+          <w:tcPr>
+            <w:tcW w:type="dxa" w:w="4760"/>
+            <w:vAlign w:val="center"/>
+          </w:tcPr>
+          <w:p>
+            <w:r>
+              <w:rPr>
+                <w:rFonts w:ascii="Calibri" w:hAnsi="Calibri"/>
+                <w:b w:val="0"/>
+                <w:i w:val="0"/>
+                <w:color w:val="1B2430"/>
+                <w:sz w:val="19"/>
+              </w:rPr>
+              <w:t>15</w:t>
+            </w:r>
+          </w:p>
+        </w:tc>
+      </w:tr>
+      <w:tr>
+        <w:tc>
+          <w:tcPr>
+            <w:tcW w:type="dxa" w:w="5320"/>
+            <w:vAlign w:val="center"/>
+          </w:tcPr>
+          <w:p>
+            <w:r>
+              <w:rPr>
+                <w:rFonts w:ascii="Calibri" w:hAnsi="Calibri"/>
+                <w:b w:val="0"/>
+                <w:i w:val="0"/>
+                <w:color w:val="1B2430"/>
+                <w:sz w:val="19"/>
+              </w:rPr>
+              <w:t>Days to appoint appraisers</w:t>
+            </w:r>
+          </w:p>
+        </w:tc>
+        <w:tc>
+          <w:tcPr>
+            <w:tcW w:type="dxa" w:w="4760"/>
+            <w:vAlign w:val="center"/>
+          </w:tcPr>
+          <w:p>
+            <w:r>
+              <w:rPr>
+                <w:rFonts w:ascii="Calibri" w:hAnsi="Calibri"/>
+                <w:b w:val="0"/>
+                <w:i w:val="0"/>
+                <w:color w:val="1B2430"/>
+                <w:sz w:val="19"/>
+              </w:rPr>
+              <w:t>15</w:t>
+            </w:r>
+          </w:p>
+        </w:tc>
+      </w:tr>
+      <w:tr>
+        <w:tc>
+          <w:tcPr>
+            <w:tcW w:type="dxa" w:w="5320"/>
+            <w:vAlign w:val="center"/>
+          </w:tcPr>
+          <w:p>
+            <w:r>
+              <w:rPr>
+                <w:rFonts w:ascii="Calibri" w:hAnsi="Calibri"/>
+                <w:b w:val="0"/>
+                <w:i w:val="0"/>
+                <w:color w:val="1B2430"/>
+                <w:sz w:val="19"/>
+              </w:rPr>
+              <w:t>Convergence band before a third appraiser</w:t>
+            </w:r>
+          </w:p>
+        </w:tc>
+        <w:tc>
+          <w:tcPr>
+            <w:tcW w:type="dxa" w:w="4760"/>
+            <w:vAlign w:val="center"/>
+          </w:tcPr>
+          <w:p>
+            <w:r>
+              <w:rPr>
+                <w:rFonts w:ascii="Calibri" w:hAnsi="Calibri"/>
+                <w:b w:val="0"/>
+                <w:i w:val="0"/>
+                <w:color w:val="1B2430"/>
+                <w:sz w:val="19"/>
+              </w:rPr>
+              <w:t>10%</w:t>
+            </w:r>
+          </w:p>
+        </w:tc>
+      </w:tr>
+      <w:tr>
+        <w:tc>
+          <w:tcPr>
+            <w:tcW w:type="dxa" w:w="5320"/>
+            <w:vAlign w:val="center"/>
+          </w:tcPr>
+          <w:p>
+            <w:r>
+              <w:rPr>
+                <w:rFonts w:ascii="Calibri" w:hAnsi="Calibri"/>
+                <w:b w:val="0"/>
+                <w:i w:val="0"/>
+                <w:color w:val="1B2430"/>
+                <w:sz w:val="19"/>
+              </w:rPr>
+              <w:t>Days for the appraisers to determine value</w:t>
+            </w:r>
+          </w:p>
+        </w:tc>
+        <w:tc>
+          <w:tcPr>
+            <w:tcW w:type="dxa" w:w="4760"/>
+            <w:vAlign w:val="center"/>
+          </w:tcPr>
+          <w:p>
+            <w:r>
+              <w:rPr>
+                <w:rFonts w:ascii="Calibri" w:hAnsi="Calibri"/>
+                <w:b w:val="0"/>
+                <w:i w:val="0"/>
+                <w:color w:val="1B2430"/>
+                <w:sz w:val="19"/>
+              </w:rPr>
+              <w:t>30</w:t>
+            </w:r>
+          </w:p>
+        </w:tc>
+      </w:tr>
+      <w:tr>
+        <w:tc>
+          <w:tcPr>
+            <w:tcW w:type="dxa" w:w="5320"/>
             <w:vAlign w:val="center"/>
           </w:tcPr>
           <w:p>
@@ -3315,7 +4672,7 @@
         </w:tc>
         <w:tc>
           <w:tcPr>
-            <w:tcW w:type="dxa" w:w="5909"/>
+            <w:tcW w:type="dxa" w:w="4760"/>
             <w:vAlign w:val="center"/>
           </w:tcPr>
           <w:p>
@@ -3335,7 +4692,7 @@
       <w:tr>
         <w:tc>
           <w:tcPr>
-            <w:tcW w:type="dxa" w:w="4171"/>
+            <w:tcW w:type="dxa" w:w="5320"/>
             <w:vAlign w:val="center"/>
           </w:tcPr>
           <w:p>
@@ -3353,7 +4710,7 @@
         </w:tc>
         <w:tc>
           <w:tcPr>
-            <w:tcW w:type="dxa" w:w="5909"/>
+            <w:tcW w:type="dxa" w:w="4760"/>
             <w:vAlign w:val="center"/>
           </w:tcPr>
           <w:p>
@@ -3373,7 +4730,7 @@
       <w:tr>
         <w:tc>
           <w:tcPr>
-            <w:tcW w:type="dxa" w:w="4171"/>
+            <w:tcW w:type="dxa" w:w="5320"/>
             <w:vAlign w:val="center"/>
           </w:tcPr>
           <w:p>
@@ -3391,7 +4748,7 @@
         </w:tc>
         <w:tc>
           <w:tcPr>
-            <w:tcW w:type="dxa" w:w="5909"/>
+            <w:tcW w:type="dxa" w:w="4760"/>
             <w:vAlign w:val="center"/>
           </w:tcPr>
           <w:p>
@@ -3411,7 +4768,7 @@
       <w:tr>
         <w:tc>
           <w:tcPr>
-            <w:tcW w:type="dxa" w:w="4171"/>
+            <w:tcW w:type="dxa" w:w="5320"/>
             <w:vAlign w:val="center"/>
           </w:tcPr>
           <w:p>
@@ -3429,7 +4786,7 @@
         </w:tc>
         <w:tc>
           <w:tcPr>
-            <w:tcW w:type="dxa" w:w="5909"/>
+            <w:tcW w:type="dxa" w:w="4760"/>
             <w:vAlign w:val="center"/>
           </w:tcPr>
           <w:p>
@@ -3449,7 +4806,7 @@
       <w:tr>
         <w:tc>
           <w:tcPr>
-            <w:tcW w:type="dxa" w:w="4171"/>
+            <w:tcW w:type="dxa" w:w="5320"/>
             <w:vAlign w:val="center"/>
           </w:tcPr>
           <w:p>
@@ -3467,7 +4824,7 @@
         </w:tc>
         <w:tc>
           <w:tcPr>
-            <w:tcW w:type="dxa" w:w="5909"/>
+            <w:tcW w:type="dxa" w:w="4760"/>
             <w:vAlign w:val="center"/>
           </w:tcPr>
           <w:p>
@@ -3487,7 +4844,7 @@
       <w:tr>
         <w:tc>
           <w:tcPr>
-            <w:tcW w:type="dxa" w:w="4171"/>
+            <w:tcW w:type="dxa" w:w="5320"/>
             <w:vAlign w:val="center"/>
           </w:tcPr>
           <w:p>
@@ -3505,7 +4862,7 @@
         </w:tc>
         <w:tc>
           <w:tcPr>
-            <w:tcW w:type="dxa" w:w="5909"/>
+            <w:tcW w:type="dxa" w:w="4760"/>
             <w:vAlign w:val="center"/>
           </w:tcPr>
           <w:p>
@@ -3525,7 +4882,7 @@
       <w:tr>
         <w:tc>
           <w:tcPr>
-            <w:tcW w:type="dxa" w:w="4171"/>
+            <w:tcW w:type="dxa" w:w="5320"/>
             <w:vAlign w:val="center"/>
           </w:tcPr>
           <w:p>
@@ -3543,7 +4900,7 @@
         </w:tc>
         <w:tc>
           <w:tcPr>
-            <w:tcW w:type="dxa" w:w="5909"/>
+            <w:tcW w:type="dxa" w:w="4760"/>
             <w:vAlign w:val="center"/>
           </w:tcPr>
           <w:p>
@@ -3563,7 +4920,7 @@
       <w:tr>
         <w:tc>
           <w:tcPr>
-            <w:tcW w:type="dxa" w:w="4171"/>
+            <w:tcW w:type="dxa" w:w="5320"/>
             <w:vAlign w:val="center"/>
           </w:tcPr>
           <w:p>
@@ -3581,7 +4938,7 @@
         </w:tc>
         <w:tc>
           <w:tcPr>
-            <w:tcW w:type="dxa" w:w="5909"/>
+            <w:tcW w:type="dxa" w:w="4760"/>
             <w:vAlign w:val="center"/>
           </w:tcPr>
           <w:p>
@@ -3601,7 +4958,7 @@
       <w:tr>
         <w:tc>
           <w:tcPr>
-            <w:tcW w:type="dxa" w:w="4171"/>
+            <w:tcW w:type="dxa" w:w="5320"/>
             <w:vAlign w:val="center"/>
           </w:tcPr>
           <w:p>
@@ -3619,7 +4976,7 @@
         </w:tc>
         <w:tc>
           <w:tcPr>
-            <w:tcW w:type="dxa" w:w="5909"/>
+            <w:tcW w:type="dxa" w:w="4760"/>
             <w:vAlign w:val="center"/>
           </w:tcPr>
           <w:p>
@@ -3639,7 +4996,7 @@
       <w:tr>
         <w:tc>
           <w:tcPr>
-            <w:tcW w:type="dxa" w:w="4171"/>
+            <w:tcW w:type="dxa" w:w="5320"/>
             <w:vAlign w:val="center"/>
           </w:tcPr>
           <w:p>
@@ -3657,7 +5014,7 @@
         </w:tc>
         <w:tc>
           <w:tcPr>
-            <w:tcW w:type="dxa" w:w="5909"/>
+            <w:tcW w:type="dxa" w:w="4760"/>
             <w:vAlign w:val="center"/>
           </w:tcPr>
           <w:p>
@@ -3670,6 +5027,44 @@
                 <w:sz w:val="19"/>
               </w:rPr>
               <w:t>75</w:t>
+            </w:r>
+          </w:p>
+        </w:tc>
+      </w:tr>
+      <w:tr>
+        <w:tc>
+          <w:tcPr>
+            <w:tcW w:type="dxa" w:w="5320"/>
+            <w:vAlign w:val="center"/>
+          </w:tcPr>
+          <w:p>
+            <w:r>
+              <w:rPr>
+                <w:rFonts w:ascii="Calibri" w:hAnsi="Calibri"/>
+                <w:b w:val="0"/>
+                <w:i w:val="0"/>
+                <w:color w:val="1B2430"/>
+                <w:sz w:val="19"/>
+              </w:rPr>
+              <w:t>Cure period for a material breach (days)</w:t>
+            </w:r>
+          </w:p>
+        </w:tc>
+        <w:tc>
+          <w:tcPr>
+            <w:tcW w:type="dxa" w:w="4760"/>
+            <w:vAlign w:val="center"/>
+          </w:tcPr>
+          <w:p>
+            <w:r>
+              <w:rPr>
+                <w:rFonts w:ascii="Calibri" w:hAnsi="Calibri"/>
+                <w:b w:val="0"/>
+                <w:i w:val="0"/>
+                <w:color w:val="1B2430"/>
+                <w:sz w:val="19"/>
+              </w:rPr>
+              <w:t>30</w:t>
             </w:r>
           </w:p>
         </w:tc>

</xml_diff>